<commit_message>
Add student KRS download and fix institution name
</commit_message>
<xml_diff>
--- a/resources/templates/krs-template.docx
+++ b/resources/templates/krs-template.docx
@@ -117,15 +117,6 @@
                 <w:szCs w:val="20"/>
               </w:rPr>
             </w:pPr>
-            <w:r>
-              <w:rPr>
-                <w:rFonts w:ascii="Arial" w:eastAsia="Arial" w:hAnsi="Arial" w:cs="Arial"/>
-                <w:color w:val="7F7F7F"/>
-                <w:sz w:val="20"/>
-                <w:szCs w:val="20"/>
-              </w:rPr>
-              <w:t>Form-1/II/2026</w:t>
-            </w:r>
           </w:p>
         </w:tc>
       </w:tr>
@@ -198,15 +189,6 @@
                 <w:szCs w:val="20"/>
               </w:rPr>
             </w:pPr>
-            <w:r>
-              <w:rPr>
-                <w:rFonts w:ascii="Arial" w:eastAsia="Arial" w:hAnsi="Arial" w:cs="Arial"/>
-                <w:color w:val="7F7F7F"/>
-                <w:sz w:val="20"/>
-                <w:szCs w:val="20"/>
-              </w:rPr>
-              <w:t>14 / 02 /2026</w:t>
-            </w:r>
           </w:p>
         </w:tc>
       </w:tr>
@@ -249,6 +231,24 @@
           <w:szCs w:val="20"/>
         </w:rPr>
         <w:t>KARTU RENCANA STUDI (KRS)</w:t>
+      </w:r>
+      <w:r>
+        <w:rPr>
+          <w:rFonts w:ascii="Arial" w:eastAsia="Arial" w:hAnsi="Arial" w:cs="Arial"/>
+          <w:color w:val="7F7F7F"/>
+          <w:sz w:val="20"/>
+          <w:szCs w:val="20"/>
+        </w:rPr>
+        <w:t xml:space="preserve"> </w:t>
+      </w:r>
+      <w:r>
+        <w:rPr>
+          <w:rFonts w:ascii="Arial" w:eastAsia="Arial" w:hAnsi="Arial" w:cs="Arial"/>
+          <w:color w:val="7F7F7F"/>
+          <w:sz w:val="20"/>
+          <w:szCs w:val="20"/>
+        </w:rPr>
+        <w:t>Form-1/II/2026</w:t>
       </w:r>
     </w:p>
     <w:p>
@@ -322,15 +322,7 @@
           <w:szCs w:val="20"/>
         </w:rPr>
         <w:tab/>
-        <w:t xml:space="preserve">: </w:t>
-      </w:r>
-      <w:r>
-        <w:rPr>
-          <w:rFonts w:ascii="Arial" w:eastAsia="Arial" w:hAnsi="Arial" w:cs="Arial"/>
-          <w:sz w:val="20"/>
-          <w:szCs w:val="20"/>
-        </w:rPr>
-        <w:t>WINDIYE MAHARANI</w:t>
+        <w:t>:</w:t>
       </w:r>
       <w:r>
         <w:rPr>
@@ -349,14 +341,6 @@
         </w:rPr>
         <w:tab/>
         <w:t xml:space="preserve">: </w:t>
-      </w:r>
-      <w:r>
-        <w:rPr>
-          <w:rFonts w:ascii="Arial" w:eastAsia="Arial" w:hAnsi="Arial" w:cs="Arial"/>
-          <w:sz w:val="20"/>
-          <w:szCs w:val="20"/>
-        </w:rPr>
-        <w:t>2</w:t>
       </w:r>
     </w:p>
     <w:p>
@@ -373,6 +357,8 @@
           <w:szCs w:val="20"/>
         </w:rPr>
       </w:pPr>
+      <w:bookmarkStart w:id="0" w:name="_heading=h.erxqf5oz4q9c" w:colFirst="0" w:colLast="0"/>
+      <w:bookmarkEnd w:id="0"/>
       <w:r>
         <w:rPr>
           <w:rFonts w:ascii="Arial" w:eastAsia="Arial" w:hAnsi="Arial" w:cs="Arial"/>
@@ -380,6 +366,24 @@
           <w:szCs w:val="20"/>
         </w:rPr>
         <w:t>NIM</w:t>
+      </w:r>
+      <w:r>
+        <w:rPr>
+          <w:rFonts w:ascii="Arial" w:eastAsia="Arial" w:hAnsi="Arial" w:cs="Arial"/>
+          <w:sz w:val="20"/>
+          <w:szCs w:val="20"/>
+        </w:rPr>
+        <w:tab/>
+        <w:t>:</w:t>
+      </w:r>
+      <w:r>
+        <w:rPr>
+          <w:rFonts w:ascii="Arial" w:eastAsia="Arial" w:hAnsi="Arial" w:cs="Arial"/>
+          <w:sz w:val="20"/>
+          <w:szCs w:val="20"/>
+        </w:rPr>
+        <w:tab/>
+        <w:t>Angkatan</w:t>
       </w:r>
       <w:r>
         <w:rPr>
@@ -389,40 +393,6 @@
         </w:rPr>
         <w:tab/>
         <w:t xml:space="preserve">: </w:t>
-      </w:r>
-      <w:r>
-        <w:rPr>
-          <w:rFonts w:ascii="Arial" w:eastAsia="Arial" w:hAnsi="Arial" w:cs="Arial"/>
-          <w:sz w:val="20"/>
-          <w:szCs w:val="20"/>
-        </w:rPr>
-        <w:t>1025207</w:t>
-      </w:r>
-      <w:r>
-        <w:rPr>
-          <w:rFonts w:ascii="Arial" w:eastAsia="Arial" w:hAnsi="Arial" w:cs="Arial"/>
-          <w:sz w:val="20"/>
-          <w:szCs w:val="20"/>
-        </w:rPr>
-        <w:tab/>
-        <w:t>Angkatan</w:t>
-      </w:r>
-      <w:r>
-        <w:rPr>
-          <w:rFonts w:ascii="Arial" w:eastAsia="Arial" w:hAnsi="Arial" w:cs="Arial"/>
-          <w:sz w:val="20"/>
-          <w:szCs w:val="20"/>
-        </w:rPr>
-        <w:tab/>
-        <w:t xml:space="preserve">: </w:t>
-      </w:r>
-      <w:r>
-        <w:rPr>
-          <w:rFonts w:ascii="Arial" w:eastAsia="Arial" w:hAnsi="Arial" w:cs="Arial"/>
-          <w:sz w:val="20"/>
-          <w:szCs w:val="20"/>
-        </w:rPr>
-        <w:t>2025/2026</w:t>
       </w:r>
     </w:p>
     <w:p>
@@ -431,21 +401,22 @@
           <w:tab w:val="left" w:pos="851"/>
           <w:tab w:val="left" w:pos="5387"/>
           <w:tab w:val="left" w:pos="6521"/>
+          <w:tab w:val="left" w:pos="7548"/>
         </w:tabs>
         <w:spacing w:after="120"/>
         <w:rPr>
           <w:rFonts w:ascii="Arial" w:eastAsia="Arial" w:hAnsi="Arial" w:cs="Arial"/>
           <w:sz w:val="20"/>
           <w:szCs w:val="20"/>
+          <w:lang w:val="it-IT"/>
         </w:rPr>
       </w:pPr>
-      <w:bookmarkStart w:id="0" w:name="_heading=h.erxqf5oz4q9c" w:colFirst="0" w:colLast="0"/>
-      <w:bookmarkEnd w:id="0"/>
-      <w:r>
-        <w:rPr>
-          <w:rFonts w:ascii="Arial" w:eastAsia="Arial" w:hAnsi="Arial" w:cs="Arial"/>
-          <w:sz w:val="20"/>
-          <w:szCs w:val="20"/>
+      <w:r>
+        <w:rPr>
+          <w:rFonts w:ascii="Arial" w:eastAsia="Arial" w:hAnsi="Arial" w:cs="Arial"/>
+          <w:sz w:val="20"/>
+          <w:szCs w:val="20"/>
+          <w:lang w:val="it-IT"/>
         </w:rPr>
         <w:t>Prodi</w:t>
       </w:r>
@@ -454,55 +425,30 @@
           <w:rFonts w:ascii="Arial" w:eastAsia="Arial" w:hAnsi="Arial" w:cs="Arial"/>
           <w:sz w:val="20"/>
           <w:szCs w:val="20"/>
+          <w:lang w:val="it-IT"/>
         </w:rPr>
         <w:tab/>
-        <w:t xml:space="preserve">: S1 Teknik </w:t>
-      </w:r>
-      <w:proofErr w:type="spellStart"/>
-      <w:r>
-        <w:rPr>
-          <w:rFonts w:ascii="Arial" w:eastAsia="Arial" w:hAnsi="Arial" w:cs="Arial"/>
-          <w:sz w:val="20"/>
-          <w:szCs w:val="20"/>
-        </w:rPr>
-        <w:t>Geologi</w:t>
-      </w:r>
-      <w:proofErr w:type="spellEnd"/>
-      <w:r>
-        <w:rPr>
-          <w:rFonts w:ascii="Arial" w:eastAsia="Arial" w:hAnsi="Arial" w:cs="Arial"/>
-          <w:sz w:val="20"/>
-          <w:szCs w:val="20"/>
+        <w:t>:</w:t>
+      </w:r>
+      <w:r>
+        <w:rPr>
+          <w:rFonts w:ascii="Arial" w:eastAsia="Arial" w:hAnsi="Arial" w:cs="Arial"/>
+          <w:sz w:val="20"/>
+          <w:szCs w:val="20"/>
+          <w:lang w:val="it-IT"/>
         </w:rPr>
         <w:tab/>
         <w:t>Dosen Wali</w:t>
       </w:r>
-      <w:proofErr w:type="gramStart"/>
-      <w:r>
-        <w:rPr>
-          <w:rFonts w:ascii="Arial" w:eastAsia="Arial" w:hAnsi="Arial" w:cs="Arial"/>
-          <w:sz w:val="20"/>
-          <w:szCs w:val="20"/>
+      <w:r>
+        <w:rPr>
+          <w:rFonts w:ascii="Arial" w:eastAsia="Arial" w:hAnsi="Arial" w:cs="Arial"/>
+          <w:sz w:val="20"/>
+          <w:szCs w:val="20"/>
+          <w:lang w:val="it-IT"/>
         </w:rPr>
         <w:tab/>
         <w:t>:</w:t>
-      </w:r>
-      <w:r>
-        <w:rPr>
-          <w:rFonts w:ascii="Arial" w:eastAsia="Arial" w:hAnsi="Arial" w:cs="Arial"/>
-          <w:sz w:val="20"/>
-          <w:szCs w:val="20"/>
-        </w:rPr>
-        <w:t>Lanang</w:t>
-      </w:r>
-      <w:proofErr w:type="gramEnd"/>
-      <w:r>
-        <w:rPr>
-          <w:rFonts w:ascii="Arial" w:eastAsia="Arial" w:hAnsi="Arial" w:cs="Arial"/>
-          <w:sz w:val="20"/>
-          <w:szCs w:val="20"/>
-        </w:rPr>
-        <w:t xml:space="preserve"> D</w:t>
       </w:r>
     </w:p>
     <w:p>
@@ -517,6 +463,7 @@
           <w:rFonts w:ascii="Arial" w:eastAsia="Arial" w:hAnsi="Arial" w:cs="Arial"/>
           <w:sz w:val="20"/>
           <w:szCs w:val="20"/>
+          <w:lang w:val="it-IT"/>
         </w:rPr>
       </w:pPr>
     </w:p>
@@ -783,16 +730,7 @@
           <w:tcPr>
             <w:tcW w:w="4440" w:type="dxa"/>
           </w:tcPr>
-          <w:p>
-            <w:proofErr w:type="spellStart"/>
-            <w:r>
-              <w:t>Matematika</w:t>
-            </w:r>
-            <w:proofErr w:type="spellEnd"/>
-            <w:r>
-              <w:t xml:space="preserve"> Dasar 2 </w:t>
-            </w:r>
-          </w:p>
+          <w:p/>
         </w:tc>
         <w:tc>
           <w:tcPr>
@@ -802,9 +740,6 @@
             <w:pPr>
               <w:jc w:val="center"/>
             </w:pPr>
-            <w:r>
-              <w:t>2</w:t>
-            </w:r>
           </w:p>
         </w:tc>
         <w:tc>
@@ -815,9 +750,6 @@
             <w:pPr>
               <w:jc w:val="center"/>
             </w:pPr>
-            <w:r>
-              <w:t>4</w:t>
-            </w:r>
           </w:p>
         </w:tc>
         <w:tc>
@@ -882,16 +814,7 @@
           <w:tcPr>
             <w:tcW w:w="4440" w:type="dxa"/>
           </w:tcPr>
-          <w:p>
-            <w:proofErr w:type="spellStart"/>
-            <w:r>
-              <w:t>Fisika</w:t>
-            </w:r>
-            <w:proofErr w:type="spellEnd"/>
-            <w:r>
-              <w:t xml:space="preserve"> Dasar 2</w:t>
-            </w:r>
-          </w:p>
+          <w:p/>
         </w:tc>
         <w:tc>
           <w:tcPr>
@@ -901,9 +824,6 @@
             <w:pPr>
               <w:jc w:val="center"/>
             </w:pPr>
-            <w:r>
-              <w:t>2</w:t>
-            </w:r>
           </w:p>
         </w:tc>
         <w:tc>
@@ -914,9 +834,6 @@
             <w:pPr>
               <w:jc w:val="center"/>
             </w:pPr>
-            <w:r>
-              <w:t>4</w:t>
-            </w:r>
           </w:p>
         </w:tc>
         <w:tc>
@@ -981,11 +898,7 @@
           <w:tcPr>
             <w:tcW w:w="4440" w:type="dxa"/>
           </w:tcPr>
-          <w:p>
-            <w:r>
-              <w:t>Kimia Dasar 2</w:t>
-            </w:r>
-          </w:p>
+          <w:p/>
         </w:tc>
         <w:tc>
           <w:tcPr>
@@ -995,9 +908,6 @@
             <w:pPr>
               <w:jc w:val="center"/>
             </w:pPr>
-            <w:r>
-              <w:t>2</w:t>
-            </w:r>
           </w:p>
         </w:tc>
         <w:tc>
@@ -1008,9 +918,6 @@
             <w:pPr>
               <w:jc w:val="center"/>
             </w:pPr>
-            <w:r>
-              <w:t>4</w:t>
-            </w:r>
           </w:p>
         </w:tc>
         <w:tc>
@@ -1075,11 +982,7 @@
           <w:tcPr>
             <w:tcW w:w="4440" w:type="dxa"/>
           </w:tcPr>
-          <w:p>
-            <w:r>
-              <w:t>Pancasila</w:t>
-            </w:r>
-          </w:p>
+          <w:p/>
         </w:tc>
         <w:tc>
           <w:tcPr>
@@ -1089,9 +992,6 @@
             <w:pPr>
               <w:jc w:val="center"/>
             </w:pPr>
-            <w:r>
-              <w:t>2</w:t>
-            </w:r>
           </w:p>
         </w:tc>
         <w:tc>
@@ -1102,9 +1002,6 @@
             <w:pPr>
               <w:jc w:val="center"/>
             </w:pPr>
-            <w:r>
-              <w:t>2</w:t>
-            </w:r>
           </w:p>
         </w:tc>
         <w:tc>
@@ -1169,11 +1066,7 @@
           <w:tcPr>
             <w:tcW w:w="4440" w:type="dxa"/>
           </w:tcPr>
-          <w:p>
-            <w:r>
-              <w:t xml:space="preserve">Bahasa Indonesia </w:t>
-            </w:r>
-          </w:p>
+          <w:p/>
         </w:tc>
         <w:tc>
           <w:tcPr>
@@ -1183,9 +1076,6 @@
             <w:pPr>
               <w:jc w:val="center"/>
             </w:pPr>
-            <w:r>
-              <w:t>2</w:t>
-            </w:r>
           </w:p>
         </w:tc>
         <w:tc>
@@ -1196,9 +1086,6 @@
             <w:pPr>
               <w:jc w:val="center"/>
             </w:pPr>
-            <w:r>
-              <w:t>2</w:t>
-            </w:r>
           </w:p>
         </w:tc>
         <w:tc>
@@ -1263,16 +1150,7 @@
           <w:tcPr>
             <w:tcW w:w="4440" w:type="dxa"/>
           </w:tcPr>
-          <w:p>
-            <w:proofErr w:type="spellStart"/>
-            <w:r>
-              <w:t>Kewarganegaraan</w:t>
-            </w:r>
-            <w:proofErr w:type="spellEnd"/>
-            <w:r>
-              <w:t xml:space="preserve"> </w:t>
-            </w:r>
-          </w:p>
+          <w:p/>
         </w:tc>
         <w:tc>
           <w:tcPr>
@@ -1282,9 +1160,6 @@
             <w:pPr>
               <w:jc w:val="center"/>
             </w:pPr>
-            <w:r>
-              <w:t>2</w:t>
-            </w:r>
           </w:p>
         </w:tc>
         <w:tc>
@@ -1295,9 +1170,6 @@
             <w:pPr>
               <w:jc w:val="center"/>
             </w:pPr>
-            <w:r>
-              <w:t>2</w:t>
-            </w:r>
           </w:p>
         </w:tc>
         <w:tc>
@@ -1362,16 +1234,7 @@
           <w:tcPr>
             <w:tcW w:w="4440" w:type="dxa"/>
           </w:tcPr>
-          <w:p>
-            <w:proofErr w:type="spellStart"/>
-            <w:r>
-              <w:t>Geologi</w:t>
-            </w:r>
-            <w:proofErr w:type="spellEnd"/>
-            <w:r>
-              <w:t xml:space="preserve"> Dinamik</w:t>
-            </w:r>
-          </w:p>
+          <w:p/>
         </w:tc>
         <w:tc>
           <w:tcPr>
@@ -1381,9 +1244,6 @@
             <w:pPr>
               <w:jc w:val="center"/>
             </w:pPr>
-            <w:r>
-              <w:t>2</w:t>
-            </w:r>
           </w:p>
         </w:tc>
         <w:tc>
@@ -1394,9 +1254,6 @@
             <w:pPr>
               <w:jc w:val="center"/>
             </w:pPr>
-            <w:r>
-              <w:t>3</w:t>
-            </w:r>
           </w:p>
         </w:tc>
         <w:tc>
@@ -1844,25 +1701,6 @@
           <w:szCs w:val="20"/>
         </w:rPr>
         <w:tab/>
-        <w:t xml:space="preserve">14 </w:t>
-      </w:r>
-      <w:proofErr w:type="spellStart"/>
-      <w:r>
-        <w:rPr>
-          <w:rFonts w:ascii="Arial" w:eastAsia="Arial" w:hAnsi="Arial" w:cs="Arial"/>
-          <w:sz w:val="20"/>
-          <w:szCs w:val="20"/>
-        </w:rPr>
-        <w:t>Februari</w:t>
-      </w:r>
-      <w:proofErr w:type="spellEnd"/>
-      <w:r>
-        <w:rPr>
-          <w:rFonts w:ascii="Arial" w:eastAsia="Arial" w:hAnsi="Arial" w:cs="Arial"/>
-          <w:sz w:val="20"/>
-          <w:szCs w:val="20"/>
-        </w:rPr>
-        <w:t xml:space="preserve"> 2026</w:t>
       </w:r>
     </w:p>
     <w:p>
@@ -1885,18 +1723,8 @@
           <w:szCs w:val="20"/>
         </w:rPr>
         <w:tab/>
-        <w:t xml:space="preserve">Prodi Teknik </w:t>
-      </w:r>
-      <w:proofErr w:type="spellStart"/>
-      <w:r>
-        <w:rPr>
-          <w:rFonts w:ascii="Arial" w:eastAsia="Arial" w:hAnsi="Arial" w:cs="Arial"/>
-          <w:sz w:val="20"/>
-          <w:szCs w:val="20"/>
-        </w:rPr>
-        <w:t>Geologi</w:t>
-      </w:r>
-      <w:proofErr w:type="spellEnd"/>
+        <w:t xml:space="preserve">Prodi </w:t>
+      </w:r>
       <w:r>
         <w:rPr>
           <w:rFonts w:ascii="Arial" w:eastAsia="Arial" w:hAnsi="Arial" w:cs="Arial"/>
@@ -1905,92 +1733,6 @@
         </w:rPr>
         <w:tab/>
         <w:t>Dosen Wali</w:t>
-      </w:r>
-    </w:p>
-    <w:p>
-      <w:pPr>
-        <w:tabs>
-          <w:tab w:val="left" w:pos="567"/>
-          <w:tab w:val="left" w:pos="7088"/>
-        </w:tabs>
-        <w:spacing w:after="120"/>
-        <w:rPr>
-          <w:rFonts w:ascii="Arial" w:eastAsia="Arial" w:hAnsi="Arial" w:cs="Arial"/>
-          <w:sz w:val="20"/>
-          <w:szCs w:val="20"/>
-        </w:rPr>
-      </w:pPr>
-      <w:r>
-        <w:rPr>
-          <w:rFonts w:ascii="Arial" w:eastAsia="Arial" w:hAnsi="Arial" w:cs="Arial"/>
-          <w:noProof/>
-          <w:sz w:val="20"/>
-          <w:szCs w:val="20"/>
-          <w:lang w:val="en-US"/>
-        </w:rPr>
-        <w:drawing>
-          <wp:anchor distT="0" distB="0" distL="114300" distR="114300" simplePos="0" relativeHeight="251659264" behindDoc="1" locked="0" layoutInCell="1" allowOverlap="1" wp14:anchorId="068F7768" wp14:editId="5377AA06">
-            <wp:simplePos x="0" y="0"/>
-            <wp:positionH relativeFrom="column">
-              <wp:posOffset>3987800</wp:posOffset>
-            </wp:positionH>
-            <wp:positionV relativeFrom="paragraph">
-              <wp:posOffset>10160</wp:posOffset>
-            </wp:positionV>
-            <wp:extent cx="1428750" cy="895350"/>
-            <wp:effectExtent l="0" t="0" r="0" b="0"/>
-            <wp:wrapThrough wrapText="bothSides">
-              <wp:wrapPolygon edited="0">
-                <wp:start x="0" y="0"/>
-                <wp:lineTo x="0" y="21140"/>
-                <wp:lineTo x="21312" y="21140"/>
-                <wp:lineTo x="21312" y="0"/>
-                <wp:lineTo x="0" y="0"/>
-              </wp:wrapPolygon>
-            </wp:wrapThrough>
-            <wp:docPr id="2" name="Picture 2"/>
-            <wp:cNvGraphicFramePr>
-              <a:graphicFrameLocks xmlns:a="http://schemas.openxmlformats.org/drawingml/2006/main" noChangeAspect="1"/>
-            </wp:cNvGraphicFramePr>
-            <a:graphic xmlns:a="http://schemas.openxmlformats.org/drawingml/2006/main">
-              <a:graphicData uri="http://schemas.openxmlformats.org/drawingml/2006/picture">
-                <pic:pic xmlns:pic="http://schemas.openxmlformats.org/drawingml/2006/picture">
-                  <pic:nvPicPr>
-                    <pic:cNvPr id="0" name="WhatsApp Image 2026-02-14 at 11.18.15 AM.jpeg"/>
-                    <pic:cNvPicPr/>
-                  </pic:nvPicPr>
-                  <pic:blipFill>
-                    <a:blip r:embed="rId7" cstate="print">
-                      <a:extLst>
-                        <a:ext uri="{28A0092B-C50C-407E-A947-70E740481C1C}">
-                          <a14:useLocalDpi xmlns:a14="http://schemas.microsoft.com/office/drawing/2010/main" val="0"/>
-                        </a:ext>
-                      </a:extLst>
-                    </a:blip>
-                    <a:stretch>
-                      <a:fillRect/>
-                    </a:stretch>
-                  </pic:blipFill>
-                  <pic:spPr>
-                    <a:xfrm>
-                      <a:off x="0" y="0"/>
-                      <a:ext cx="1428750" cy="895350"/>
-                    </a:xfrm>
-                    <a:prstGeom prst="rect">
-                      <a:avLst/>
-                    </a:prstGeom>
-                  </pic:spPr>
-                </pic:pic>
-              </a:graphicData>
-            </a:graphic>
-            <wp14:sizeRelH relativeFrom="page">
-              <wp14:pctWidth>0</wp14:pctWidth>
-            </wp14:sizeRelH>
-            <wp14:sizeRelV relativeFrom="page">
-              <wp14:pctHeight>0</wp14:pctHeight>
-            </wp14:sizeRelV>
-          </wp:anchor>
-        </w:drawing>
       </w:r>
     </w:p>
     <w:p>
@@ -2044,126 +1786,18 @@
         <w:ind w:right="-188"/>
         <w:rPr>
           <w:rFonts w:ascii="Arial" w:eastAsia="Arial" w:hAnsi="Arial" w:cs="Arial"/>
-          <w:b/>
-          <w:bCs/>
-          <w:sz w:val="20"/>
-          <w:szCs w:val="20"/>
-          <w:u w:val="single"/>
+          <w:sz w:val="20"/>
+          <w:szCs w:val="20"/>
         </w:rPr>
       </w:pPr>
       <w:r>
         <w:rPr>
           <w:rFonts w:ascii="Arial" w:eastAsia="Arial" w:hAnsi="Arial" w:cs="Arial"/>
-          <w:b/>
-          <w:bCs/>
-          <w:sz w:val="20"/>
-          <w:szCs w:val="20"/>
-          <w:u w:val="single"/>
-        </w:rPr>
-        <w:t xml:space="preserve">Ir. </w:t>
-      </w:r>
-      <w:proofErr w:type="spellStart"/>
-      <w:r>
-        <w:rPr>
-          <w:rFonts w:ascii="Arial" w:eastAsia="Arial" w:hAnsi="Arial" w:cs="Arial"/>
-          <w:b/>
-          <w:bCs/>
-          <w:sz w:val="20"/>
-          <w:szCs w:val="20"/>
-          <w:u w:val="single"/>
-        </w:rPr>
-        <w:t>Tholcani</w:t>
-      </w:r>
-      <w:proofErr w:type="spellEnd"/>
-      <w:r>
-        <w:rPr>
-          <w:rFonts w:ascii="Arial" w:eastAsia="Arial" w:hAnsi="Arial" w:cs="Arial"/>
-          <w:b/>
-          <w:bCs/>
-          <w:sz w:val="20"/>
-          <w:szCs w:val="20"/>
-          <w:u w:val="single"/>
-        </w:rPr>
-        <w:t>, S.T., M.T., IPU</w:t>
-      </w:r>
-      <w:r>
-        <w:rPr>
-          <w:rFonts w:ascii="Arial" w:eastAsia="Arial" w:hAnsi="Arial" w:cs="Arial"/>
           <w:sz w:val="20"/>
           <w:szCs w:val="20"/>
         </w:rPr>
         <w:tab/>
       </w:r>
-      <w:r>
-        <w:rPr>
-          <w:rFonts w:ascii="Arial" w:eastAsia="Arial" w:hAnsi="Arial" w:cs="Arial"/>
-          <w:b/>
-          <w:bCs/>
-          <w:sz w:val="20"/>
-          <w:szCs w:val="20"/>
-          <w:u w:val="single"/>
-        </w:rPr>
-        <w:t xml:space="preserve">            </w:t>
-      </w:r>
-      <w:r>
-        <w:rPr>
-          <w:rFonts w:ascii="Arial" w:eastAsia="Arial" w:hAnsi="Arial" w:cs="Arial"/>
-          <w:b/>
-          <w:bCs/>
-          <w:sz w:val="20"/>
-          <w:szCs w:val="20"/>
-          <w:u w:val="single"/>
-        </w:rPr>
-        <w:t xml:space="preserve">Lanang </w:t>
-      </w:r>
-      <w:proofErr w:type="spellStart"/>
-      <w:r>
-        <w:rPr>
-          <w:rFonts w:ascii="Arial" w:eastAsia="Arial" w:hAnsi="Arial" w:cs="Arial"/>
-          <w:b/>
-          <w:bCs/>
-          <w:sz w:val="20"/>
-          <w:szCs w:val="20"/>
-          <w:u w:val="single"/>
-        </w:rPr>
-        <w:t>Delonik</w:t>
-      </w:r>
-      <w:proofErr w:type="spellEnd"/>
-      <w:r>
-        <w:rPr>
-          <w:rFonts w:ascii="Arial" w:eastAsia="Arial" w:hAnsi="Arial" w:cs="Arial"/>
-          <w:b/>
-          <w:bCs/>
-          <w:sz w:val="20"/>
-          <w:szCs w:val="20"/>
-          <w:u w:val="single"/>
-        </w:rPr>
-        <w:t xml:space="preserve"> R, S.T., M.T</w:t>
-      </w:r>
-      <w:r>
-        <w:rPr>
-          <w:rFonts w:ascii="Arial" w:eastAsia="Arial" w:hAnsi="Arial" w:cs="Arial"/>
-          <w:b/>
-          <w:bCs/>
-          <w:sz w:val="20"/>
-          <w:szCs w:val="20"/>
-          <w:u w:val="single"/>
-        </w:rPr>
-        <w:t xml:space="preserve">                                           </w:t>
-      </w:r>
-      <w:proofErr w:type="gramStart"/>
-      <w:r>
-        <w:rPr>
-          <w:rFonts w:ascii="Arial" w:eastAsia="Arial" w:hAnsi="Arial" w:cs="Arial"/>
-          <w:b/>
-          <w:bCs/>
-          <w:sz w:val="20"/>
-          <w:szCs w:val="20"/>
-          <w:u w:val="single"/>
-        </w:rPr>
-        <w:t xml:space="preserve">  .</w:t>
-      </w:r>
-      <w:proofErr w:type="gramEnd"/>
     </w:p>
     <w:p>
       <w:pPr>
@@ -2178,45 +1812,9 @@
           <w:szCs w:val="20"/>
         </w:rPr>
       </w:pPr>
-      <w:r>
-        <w:rPr>
-          <w:rFonts w:ascii="Arial" w:eastAsia="Arial" w:hAnsi="Arial" w:cs="Arial"/>
-          <w:sz w:val="20"/>
-          <w:szCs w:val="20"/>
-        </w:rPr>
-        <w:t>NIDN: 0423086702</w:t>
-      </w:r>
-      <w:r>
-        <w:rPr>
-          <w:rFonts w:ascii="Arial" w:eastAsia="Arial" w:hAnsi="Arial" w:cs="Arial"/>
-          <w:sz w:val="20"/>
-          <w:szCs w:val="20"/>
-        </w:rPr>
-        <w:t xml:space="preserve">                                                                                   </w:t>
-      </w:r>
-      <w:r>
-        <w:rPr>
-          <w:color w:val="000000"/>
-        </w:rPr>
-        <w:t>NUPTK: 6535772673130323</w:t>
-      </w:r>
-    </w:p>
-    <w:p>
-      <w:pPr>
-        <w:tabs>
-          <w:tab w:val="left" w:pos="5954"/>
-        </w:tabs>
-        <w:spacing w:after="120"/>
-        <w:ind w:right="-188"/>
-        <w:rPr>
-          <w:rFonts w:ascii="Arial" w:eastAsia="Arial" w:hAnsi="Arial" w:cs="Arial"/>
-          <w:sz w:val="20"/>
-          <w:szCs w:val="20"/>
-        </w:rPr>
-      </w:pPr>
     </w:p>
     <w:sectPr>
-      <w:headerReference w:type="default" r:id="rId8"/>
+      <w:headerReference w:type="default" r:id="rId7"/>
       <w:pgSz w:w="11906" w:h="16838"/>
       <w:pgMar w:top="1134" w:right="1274" w:bottom="1440" w:left="1440" w:header="426" w:footer="708" w:gutter="0"/>
       <w:pgNumType w:start="1"/>

</xml_diff>